<commit_message>
fix(doc): reformat tables and rendusrncp (v2)
</commit_message>
<xml_diff>
--- a/rendusrncp/BLOC2RNCP.docx
+++ b/rendusrncp/BLOC2RNCP.docx
@@ -515,6 +515,11 @@
       <w:r>
         <w:lastRenderedPageBreak/>
         <w:t>Cartographie des compétences Bloc 2</w:t>
+      </w:r>
+    </w:p>
+    <w:p>
+      <w:r>
+        <w:t>État au 07/07/2026 : plus aucune tâche de code restante. Tests (162 backend + 39 frontend), audits (composer/npm 0 vulnérabilité), headers de sécurité HSTS/CSP (vérifiés en direct sur prod ET staging), CHANGELOG.md, dependabot.yml et templates d'issues sont en place sur les 3 repos. Reste : rédaction finale (Phase C), captures visuelles, exécution des 8 derniers scénarios du cahier de recettes, et tag/release v1.0.0.</w:t>
       </w:r>
     </w:p>
     <w:p>
@@ -5442,11 +5447,7 @@
           </w:tcPr>
           <w:p>
             <w:r>
-              <w:rPr>
-                <w:sz w:val="18"/>
-                <w:szCs w:val="18"/>
-              </w:rPr>
-              <w:t>À PRODUIRE</w:t>
+              <w:t>DISPONIBLE</w:t>
             </w:r>
           </w:p>
         </w:tc>
@@ -5548,11 +5549,7 @@
           </w:tcPr>
           <w:p>
             <w:r>
-              <w:rPr>
-                <w:sz w:val="18"/>
-                <w:szCs w:val="18"/>
-              </w:rPr>
-              <w:t>À PRODUIRE</w:t>
+              <w:t>DISPONIBLE</w:t>
             </w:r>
           </w:p>
         </w:tc>
@@ -6004,11 +6001,7 @@
           </w:tcPr>
           <w:p>
             <w:r>
-              <w:rPr>
-                <w:sz w:val="18"/>
-                <w:szCs w:val="18"/>
-              </w:rPr>
-              <w:t>À PRODUIRE</w:t>
+              <w:t>DISPONIBLE</w:t>
             </w:r>
           </w:p>
         </w:tc>
@@ -7597,11 +7590,7 @@
           </w:tcPr>
           <w:p>
             <w:r>
-              <w:rPr>
-                <w:sz w:val="18"/>
-                <w:szCs w:val="18"/>
-              </w:rPr>
-              <w:t>Suite de tests (145 PHPUnit backend + 39 Jest frontend, tous verts)</w:t>
+              <w:t>Suite de tests (162 PHPUnit backend + 39 Jest frontend, tous verts — vérifié 07/07/2026)</w:t>
             </w:r>
           </w:p>
         </w:tc>
@@ -8609,11 +8598,7 @@
           </w:tcPr>
           <w:p>
             <w:r>
-              <w:rPr>
-                <w:sz w:val="18"/>
-                <w:szCs w:val="18"/>
-              </w:rPr>
-              <w:t>À PRODUIRE — ÉLIMINATOIRE</w:t>
+              <w:t>86 Passé / 8 À jouer sur 94 (SEC-01/SEC-02 corrigés et vérifiés en direct sur prod+staging le 07/07/2026 — xlsx à mettre à jour)</w:t>
             </w:r>
           </w:p>
         </w:tc>
@@ -11039,11 +11024,7 @@
           </w:tcPr>
           <w:p>
             <w:r>
-              <w:rPr>
-                <w:sz w:val="18"/>
-                <w:szCs w:val="18"/>
-              </w:rPr>
-              <w:t>À PRODUIRE</w:t>
+              <w:t>DISPONIBLE (comptes jury-client/jury-admin créés en prod le 06/07/2026)</w:t>
             </w:r>
           </w:p>
         </w:tc>
@@ -12246,11 +12227,7 @@
           </w:tcPr>
           <w:p>
             <w:r>
-              <w:rPr>
-                <w:sz w:val="18"/>
-                <w:szCs w:val="18"/>
-              </w:rPr>
-              <w:t>Jouer les 94 scénarios du cahier de recettes + captures preuves</w:t>
+              <w:t>Rejouer les 8 scénarios restants + mettre à jour le statut SEC-01/SEC-02 (déjà corrigés) dans le xlsx</w:t>
             </w:r>
           </w:p>
         </w:tc>
@@ -12272,11 +12249,7 @@
           </w:tcPr>
           <w:p>
             <w:r>
-              <w:rPr>
-                <w:sz w:val="18"/>
-                <w:szCs w:val="18"/>
-              </w:rPr>
-              <w:t>2-3 h</w:t>
+              <w:t>30 min</w:t>
             </w:r>
           </w:p>
         </w:tc>
@@ -12686,27 +12659,7 @@
           </w:tcPr>
           <w:p>
             <w:r>
-              <w:rPr>
-                <w:sz w:val="18"/>
-                <w:szCs w:val="18"/>
-              </w:rPr>
-              <w:t xml:space="preserve">Captures Lighthouse </w:t>
-            </w:r>
-            <w:proofErr w:type="spellStart"/>
-            <w:r>
-              <w:rPr>
-                <w:sz w:val="18"/>
-                <w:szCs w:val="18"/>
-              </w:rPr>
-              <w:t>Accessibility</w:t>
-            </w:r>
-            <w:proofErr w:type="spellEnd"/>
-            <w:r>
-              <w:rPr>
-                <w:sz w:val="18"/>
-                <w:szCs w:val="18"/>
-              </w:rPr>
-              <w:t xml:space="preserve"> (4 pages)</w:t>
+              <w:t>Fait — rapports Lighthouse avant/après correctifs générés (lighthouse/*.report.html)</w:t>
             </w:r>
           </w:p>
         </w:tc>
@@ -12728,11 +12681,7 @@
           </w:tcPr>
           <w:p>
             <w:r>
-              <w:rPr>
-                <w:sz w:val="18"/>
-                <w:szCs w:val="18"/>
-              </w:rPr>
-              <w:t>1 h</w:t>
+              <w:t>—</w:t>
             </w:r>
           </w:p>
         </w:tc>
@@ -13025,36 +12974,8 @@
             </w:tcMar>
           </w:tcPr>
           <w:p>
-            <w:pPr>
-              <w:rPr>
-                <w:lang w:val="en-US"/>
-              </w:rPr>
-            </w:pPr>
-            <w:r>
-              <w:rPr>
-                <w:sz w:val="18"/>
-                <w:szCs w:val="18"/>
-                <w:lang w:val="en-US"/>
-              </w:rPr>
-              <w:t>Captures VPS (</w:t>
-            </w:r>
-            <w:proofErr w:type="spellStart"/>
-            <w:r>
-              <w:rPr>
-                <w:sz w:val="18"/>
-                <w:szCs w:val="18"/>
-                <w:lang w:val="en-US"/>
-              </w:rPr>
-              <w:t>sshd_config</w:t>
-            </w:r>
-            <w:proofErr w:type="spellEnd"/>
-            <w:r>
-              <w:rPr>
-                <w:sz w:val="18"/>
-                <w:szCs w:val="18"/>
-                <w:lang w:val="en-US"/>
-              </w:rPr>
-              <w:t>, ufw, backup)</w:t>
+            <w:r>
+              <w:t>Captures VPS (sshd_config, ufw) — script de backup chiffré GPG à vérifier/documenter (non retrouvé versionné dans infra/)</w:t>
             </w:r>
           </w:p>
         </w:tc>
@@ -13155,18 +13076,8 @@
             </w:tcMar>
           </w:tcPr>
           <w:p>
-            <w:pPr>
-              <w:rPr>
-                <w:lang w:val="en-US"/>
-              </w:rPr>
-            </w:pPr>
-            <w:r>
-              <w:rPr>
-                <w:sz w:val="18"/>
-                <w:szCs w:val="18"/>
-                <w:lang w:val="en-US"/>
-              </w:rPr>
-              <w:t>CHANGELOG.md + Release GitHub v1.0.0</w:t>
+            <w:r>
+              <w:t>CHANGELOG.md fait (backend + frontend) — reste tag v1.0.0 + Release GitHub</w:t>
             </w:r>
           </w:p>
         </w:tc>
@@ -13188,11 +13099,7 @@
           </w:tcPr>
           <w:p>
             <w:r>
-              <w:rPr>
-                <w:sz w:val="18"/>
-                <w:szCs w:val="18"/>
-              </w:rPr>
-              <w:t>1 h</w:t>
+              <w:t>30 min</w:t>
             </w:r>
           </w:p>
         </w:tc>
@@ -13717,348 +13624,7 @@
           <w:lang w:val="en-US"/>
         </w:rPr>
       </w:pPr>
-      <w:r>
-        <w:rPr>
-          <w:lang w:val="en-US"/>
-        </w:rPr>
-        <w:t xml:space="preserve">Ok parfait </w:t>
-      </w:r>
-      <w:proofErr w:type="spellStart"/>
-      <w:r>
-        <w:rPr>
-          <w:lang w:val="en-US"/>
-        </w:rPr>
-        <w:t>regarde</w:t>
-      </w:r>
-      <w:proofErr w:type="spellEnd"/>
-      <w:r>
-        <w:rPr>
-          <w:lang w:val="en-US"/>
-        </w:rPr>
-        <w:t xml:space="preserve"> : ubuntu@vps-a933dda1:~$ docker exec -it </w:t>
-      </w:r>
-      <w:proofErr w:type="spellStart"/>
-      <w:r>
-        <w:rPr>
-          <w:lang w:val="en-US"/>
-        </w:rPr>
-        <w:t>gf_backend</w:t>
-      </w:r>
-      <w:proofErr w:type="spellEnd"/>
-      <w:r>
-        <w:rPr>
-          <w:lang w:val="en-US"/>
-        </w:rPr>
-        <w:t xml:space="preserve"> php artisan tinker Psy Shell v0.12.23 (PHP 8.3.32 — cli) by Justin Hileman New PHP manual is available (latest: 3.1.1). Update with doc --update-manual &gt; $client = \App\Models\User::</w:t>
-      </w:r>
-      <w:proofErr w:type="spellStart"/>
-      <w:r>
-        <w:rPr>
-          <w:lang w:val="en-US"/>
-        </w:rPr>
-        <w:t>firstOrCreate</w:t>
-      </w:r>
-      <w:proofErr w:type="spellEnd"/>
-      <w:r>
-        <w:rPr>
-          <w:lang w:val="en-US"/>
-        </w:rPr>
-        <w:t>( ['email' =&gt; 'jury-client@gauthierfitness.fr'], ['</w:t>
-      </w:r>
-      <w:proofErr w:type="spellStart"/>
-      <w:r>
-        <w:rPr>
-          <w:lang w:val="en-US"/>
-        </w:rPr>
-        <w:t>firstname</w:t>
-      </w:r>
-      <w:proofErr w:type="spellEnd"/>
-      <w:r>
-        <w:rPr>
-          <w:lang w:val="en-US"/>
-        </w:rPr>
-        <w:t>' =&gt; 'Jury', '</w:t>
-      </w:r>
-      <w:proofErr w:type="spellStart"/>
-      <w:r>
-        <w:rPr>
-          <w:lang w:val="en-US"/>
-        </w:rPr>
-        <w:t>lastname</w:t>
-      </w:r>
-      <w:proofErr w:type="spellEnd"/>
-      <w:r>
-        <w:rPr>
-          <w:lang w:val="en-US"/>
-        </w:rPr>
-        <w:t>' =&gt; 'Client', 'password' =&gt; bcrypt('MotDePasseSolide!24'), '</w:t>
-      </w:r>
-      <w:proofErr w:type="spellStart"/>
-      <w:r>
-        <w:rPr>
-          <w:lang w:val="en-US"/>
-        </w:rPr>
-        <w:t>email_verified_at</w:t>
-      </w:r>
-      <w:proofErr w:type="spellEnd"/>
-      <w:r>
-        <w:rPr>
-          <w:lang w:val="en-US"/>
-        </w:rPr>
-        <w:t xml:space="preserve">' =&gt; now()] ); = App\Models\User {#8357 email: "jury-client@gauthierfitness.fr", </w:t>
-      </w:r>
-      <w:proofErr w:type="spellStart"/>
-      <w:r>
-        <w:rPr>
-          <w:lang w:val="en-US"/>
-        </w:rPr>
-        <w:t>firstname</w:t>
-      </w:r>
-      <w:proofErr w:type="spellEnd"/>
-      <w:r>
-        <w:rPr>
-          <w:lang w:val="en-US"/>
-        </w:rPr>
-        <w:t xml:space="preserve">: "Jury", </w:t>
-      </w:r>
-      <w:proofErr w:type="spellStart"/>
-      <w:r>
-        <w:rPr>
-          <w:lang w:val="en-US"/>
-        </w:rPr>
-        <w:t>lastname</w:t>
-      </w:r>
-      <w:proofErr w:type="spellEnd"/>
-      <w:r>
-        <w:rPr>
-          <w:lang w:val="en-US"/>
-        </w:rPr>
-        <w:t xml:space="preserve">: "Client", #password: "\$2y\$12\$8erXPm1GuMXiONYXO.3V5OwV48FlshxCdcyI1uVz94xvZXKLVrAhK", </w:t>
-      </w:r>
-      <w:proofErr w:type="spellStart"/>
-      <w:r>
-        <w:rPr>
-          <w:lang w:val="en-US"/>
-        </w:rPr>
-        <w:t>updated_at</w:t>
-      </w:r>
-      <w:proofErr w:type="spellEnd"/>
-      <w:r>
-        <w:rPr>
-          <w:lang w:val="en-US"/>
-        </w:rPr>
-        <w:t xml:space="preserve">: "2026-07-06 23:26:02", </w:t>
-      </w:r>
-      <w:proofErr w:type="spellStart"/>
-      <w:r>
-        <w:rPr>
-          <w:lang w:val="en-US"/>
-        </w:rPr>
-        <w:t>created_at</w:t>
-      </w:r>
-      <w:proofErr w:type="spellEnd"/>
-      <w:r>
-        <w:rPr>
-          <w:lang w:val="en-US"/>
-        </w:rPr>
-        <w:t>: "2026-07-06 23:26:02", id: 4, +name: "Jury Client", } &gt; $admin = \App\Models\User::</w:t>
-      </w:r>
-      <w:proofErr w:type="spellStart"/>
-      <w:r>
-        <w:rPr>
-          <w:lang w:val="en-US"/>
-        </w:rPr>
-        <w:t>firstOrCreate</w:t>
-      </w:r>
-      <w:proofErr w:type="spellEnd"/>
-      <w:r>
-        <w:rPr>
-          <w:lang w:val="en-US"/>
-        </w:rPr>
-        <w:t>( ['email' =&gt; 'jury-admin@gauthierfitness.fr'], ['</w:t>
-      </w:r>
-      <w:proofErr w:type="spellStart"/>
-      <w:r>
-        <w:rPr>
-          <w:lang w:val="en-US"/>
-        </w:rPr>
-        <w:t>firstname</w:t>
-      </w:r>
-      <w:proofErr w:type="spellEnd"/>
-      <w:r>
-        <w:rPr>
-          <w:lang w:val="en-US"/>
-        </w:rPr>
-        <w:t>' =&gt; 'Jury', '</w:t>
-      </w:r>
-      <w:proofErr w:type="spellStart"/>
-      <w:r>
-        <w:rPr>
-          <w:lang w:val="en-US"/>
-        </w:rPr>
-        <w:t>lastname</w:t>
-      </w:r>
-      <w:proofErr w:type="spellEnd"/>
-      <w:r>
-        <w:rPr>
-          <w:lang w:val="en-US"/>
-        </w:rPr>
-        <w:t>' =&gt; 'Admin', 'password' =&gt; bcrypt('MotDePasseSolide!24'), '</w:t>
-      </w:r>
-      <w:proofErr w:type="spellStart"/>
-      <w:r>
-        <w:rPr>
-          <w:lang w:val="en-US"/>
-        </w:rPr>
-        <w:t>email_verified_at</w:t>
-      </w:r>
-      <w:proofErr w:type="spellEnd"/>
-      <w:r>
-        <w:rPr>
-          <w:lang w:val="en-US"/>
-        </w:rPr>
-        <w:t xml:space="preserve">' =&gt; now()] ); = App\Models\User {#7640 email: "jury-admin@gauthierfitness.fr", </w:t>
-      </w:r>
-      <w:proofErr w:type="spellStart"/>
-      <w:r>
-        <w:rPr>
-          <w:lang w:val="en-US"/>
-        </w:rPr>
-        <w:t>firstname</w:t>
-      </w:r>
-      <w:proofErr w:type="spellEnd"/>
-      <w:r>
-        <w:rPr>
-          <w:lang w:val="en-US"/>
-        </w:rPr>
-        <w:t xml:space="preserve">: "Jury", </w:t>
-      </w:r>
-      <w:proofErr w:type="spellStart"/>
-      <w:r>
-        <w:rPr>
-          <w:lang w:val="en-US"/>
-        </w:rPr>
-        <w:t>lastname</w:t>
-      </w:r>
-      <w:proofErr w:type="spellEnd"/>
-      <w:r>
-        <w:rPr>
-          <w:lang w:val="en-US"/>
-        </w:rPr>
-        <w:t xml:space="preserve">: "Admin", #password: "\$2y\$12\$bUXWmEVbbwZZtVN/1voFZ.pyJHDG9BHAgc.E9FQX0VfWrsaEAcLum", </w:t>
-      </w:r>
-      <w:proofErr w:type="spellStart"/>
-      <w:r>
-        <w:rPr>
-          <w:lang w:val="en-US"/>
-        </w:rPr>
-        <w:t>updated_at</w:t>
-      </w:r>
-      <w:proofErr w:type="spellEnd"/>
-      <w:r>
-        <w:rPr>
-          <w:lang w:val="en-US"/>
-        </w:rPr>
-        <w:t xml:space="preserve">: "2026-07-06 23:26:17", </w:t>
-      </w:r>
-      <w:proofErr w:type="spellStart"/>
-      <w:r>
-        <w:rPr>
-          <w:lang w:val="en-US"/>
-        </w:rPr>
-        <w:t>created_at</w:t>
-      </w:r>
-      <w:proofErr w:type="spellEnd"/>
-      <w:r>
-        <w:rPr>
-          <w:lang w:val="en-US"/>
-        </w:rPr>
-        <w:t>: "2026-07-06 23:26:17", id: 5, +name: "Jury Admin", } &gt; $</w:t>
-      </w:r>
-      <w:proofErr w:type="spellStart"/>
-      <w:r>
-        <w:rPr>
-          <w:lang w:val="en-US"/>
-        </w:rPr>
-        <w:t>adminRole</w:t>
-      </w:r>
-      <w:proofErr w:type="spellEnd"/>
-      <w:r>
-        <w:rPr>
-          <w:lang w:val="en-US"/>
-        </w:rPr>
-        <w:t xml:space="preserve"> = \App\Models\Role::</w:t>
-      </w:r>
-      <w:proofErr w:type="spellStart"/>
-      <w:r>
-        <w:rPr>
-          <w:lang w:val="en-US"/>
-        </w:rPr>
-        <w:t>firstOrCreate</w:t>
-      </w:r>
-      <w:proofErr w:type="spellEnd"/>
-      <w:r>
-        <w:rPr>
-          <w:lang w:val="en-US"/>
-        </w:rPr>
-        <w:t xml:space="preserve">(['name' =&gt; 'admin']); = App\Models\Role {#8835 id: 1, name: "admin", </w:t>
-      </w:r>
-      <w:proofErr w:type="spellStart"/>
-      <w:r>
-        <w:rPr>
-          <w:lang w:val="en-US"/>
-        </w:rPr>
-        <w:t>created_at</w:t>
-      </w:r>
-      <w:proofErr w:type="spellEnd"/>
-      <w:r>
-        <w:rPr>
-          <w:lang w:val="en-US"/>
-        </w:rPr>
-        <w:t xml:space="preserve">: "2026-05-28 13:27:15", </w:t>
-      </w:r>
-      <w:proofErr w:type="spellStart"/>
-      <w:r>
-        <w:rPr>
-          <w:lang w:val="en-US"/>
-        </w:rPr>
-        <w:t>updated_at</w:t>
-      </w:r>
-      <w:proofErr w:type="spellEnd"/>
-      <w:r>
-        <w:rPr>
-          <w:lang w:val="en-US"/>
-        </w:rPr>
-        <w:t>: "2026-05-28 13:27:15", } &gt; $admin-&gt;roles()-&gt;</w:t>
-      </w:r>
-      <w:proofErr w:type="spellStart"/>
-      <w:r>
-        <w:rPr>
-          <w:lang w:val="en-US"/>
-        </w:rPr>
-        <w:t>syncWithoutDetaching</w:t>
-      </w:r>
-      <w:proofErr w:type="spellEnd"/>
-      <w:r>
-        <w:rPr>
-          <w:lang w:val="en-US"/>
-        </w:rPr>
-        <w:t>([$</w:t>
-      </w:r>
-      <w:proofErr w:type="spellStart"/>
-      <w:r>
-        <w:rPr>
-          <w:lang w:val="en-US"/>
-        </w:rPr>
-        <w:t>adminRole</w:t>
-      </w:r>
-      <w:proofErr w:type="spellEnd"/>
-      <w:r>
-        <w:rPr>
-          <w:lang w:val="en-US"/>
-        </w:rPr>
-        <w:t>-&gt;id]); = [ "attached" =&gt; [ 1, ], "detached" =&gt; [], "updated" =&gt; [], ] &gt;</w:t>
-      </w:r>
+      <w:r/>
     </w:p>
     <w:p>
       <w:pPr>
@@ -14092,7 +13658,7 @@
         </w:rPr>
       </w:pPr>
       <w:r>
-        <w:t>cahier de recettes à 84 Passé / 2 Échec / 8 À jouer sur 94, Sentry et fiches d'incident finalisés, comptes jury créés en prod. Il te reste : déployer GF31 (réglera SEC-01/02 automatiquement), tag v1.0.0 + Release GitHub, et Cypress E2E + captures INFRA-02/03/04. À bientôt sur la suite.</w:t>
+        <w:t>État de suivi (dernière mise à jour 07/07/2026) : cahier de recettes à 86 Passé / 8 À jouer sur 94 (SEC-01/SEC-02 corrigés, vérifiés en direct sur prod et staging). Sentry et 6 fiches d'incident finalisées (rendusrncp/FICHES_INCIDENTS.md), comptes jury créés en prod. Reste : tag v1.0.0 + Release GitHub, rejouer les 8 derniers scénarios, captures visuelles, rédaction finale (Phase C).</w:t>
       </w:r>
     </w:p>
     <w:sectPr>

</xml_diff>